<commit_message>
Termin 4 auf neue Folienstruktur umgestellt
Folien mit Lernzielen, Sprechernotizen, Kernpunkten und Hausaufgabe; reale
Fälle Hochschule Mainz 2025, Dyn 2016, KDZ Mainz/KGRZ Koblenz 2026,
Azure AD 2021, AWS S3 2017 und Count+Care 2022 (Hochschule Mainz nur nach
veröffentlichten Meldungen). Neun Diagramme aus assets/diagramme_termin04.py.
Skript 04 mit acht Ergänzungskästen, Lernseite 04 mit Fällen, Abbildungen,
Irrtümer-Tabelle und Hausaufgabe, Quellen ergänzt. Alter Stand in mainold.qmd.

Co-Authored-By: Claude Opus 5.5 <noreply@anthropic.com>
Claude-Session: https://claude.ai/code/session_019AKRcSFJLTDWp1piFs5NWn
</commit_message>
<xml_diff>
--- a/_output/skripte/Skript-04.docx
+++ b/_output/skripte/Skript-04.docx
@@ -57,7 +57,7 @@
         <w:pStyle w:val="BodyText"/>
       </w:pPr>
       <w:r>
-        <w:t xml:space="preserve">Die mit „Hinweis zur Aktualität“ markierten Kästen wurden bei der Überführung ins Quarto-Projekt ergänzt. Der übrige Text entspricht dem Skript aus dem Wintersemester 2025/26; korrigiert wurden nur Tipp- und Umbruchfehler.</w:t>
+        <w:t xml:space="preserve">Die mit „Hinweis zur Aktualität“ und „Ergänzung zur Vorlesung“ markierten Kästen sowie die Abbildungen wurden bei der Überführung ins Quarto-Projekt ergänzt. Der übrige Text entspricht dem Skript aus dem Wintersemester 2025/26; korrigiert wurden nur Tipp- und Umbruchfehler.</w:t>
       </w:r>
     </w:p>
     <w:bookmarkStart w:id="19" w:name="einleitung-und-zielsetzung-der-sitzung"/>
@@ -293,7 +293,7 @@
       </w:r>
     </w:p>
     <w:bookmarkEnd w:id="19"/>
-    <w:bookmarkStart w:id="26" w:name="Xd63d3765b3689a733910fc6dc6ab8d628ee7130"/>
+    <w:bookmarkStart w:id="29" w:name="Xd63d3765b3689a733910fc6dc6ab8d628ee7130"/>
     <w:p>
       <w:pPr>
         <w:pStyle w:val="Heading1"/>
@@ -498,7 +498,7 @@
       </w:r>
     </w:p>
     <w:bookmarkEnd w:id="24"/>
-    <w:bookmarkStart w:id="25" w:name="supply-chain-angriffe"/>
+    <w:bookmarkStart w:id="28" w:name="supply-chain-angriffe"/>
     <w:p>
       <w:pPr>
         <w:pStyle w:val="Heading2"/>
@@ -586,9 +586,64 @@
         <w:t xml:space="preserve">angewendet werden muss.</w:t>
       </w:r>
     </w:p>
-    <w:bookmarkEnd w:id="25"/>
-    <w:bookmarkEnd w:id="26"/>
-    <w:bookmarkStart w:id="27" w:name="X8e67052230c26c30451e415e83a921517a6173e"/>
+    <w:p>
+      <w:pPr>
+        <w:pStyle w:val="CaptionedFigure"/>
+      </w:pPr>
+      <w:r>
+        <w:drawing>
+          <wp:inline>
+            <wp:extent cx="3739515" cy="2853035"/>
+            <wp:effectExtent b="0" l="0" r="0" t="0"/>
+            <wp:docPr descr="Sechs Bedrohungsklassen und was sie dem System nehmen" title="" id="26" name="Picture"/>
+            <a:graphic>
+              <a:graphicData uri="http://schemas.openxmlformats.org/drawingml/2006/picture">
+                <pic:pic>
+                  <pic:nvPicPr>
+                    <pic:cNvPr descr="../Präsentationen/Termin-04/assets/bedrohungsklassen.png" id="27" name="Picture"/>
+                    <pic:cNvPicPr>
+                      <a:picLocks noChangeArrowheads="1" noChangeAspect="1"/>
+                    </pic:cNvPicPr>
+                  </pic:nvPicPr>
+                  <pic:blipFill>
+                    <a:blip r:embed="rId25"/>
+                    <a:stretch>
+                      <a:fillRect/>
+                    </a:stretch>
+                  </pic:blipFill>
+                  <pic:spPr bwMode="auto">
+                    <a:xfrm>
+                      <a:off x="0" y="0"/>
+                      <a:ext cx="3739515" cy="2853035"/>
+                    </a:xfrm>
+                    <a:prstGeom prst="rect">
+                      <a:avLst/>
+                    </a:prstGeom>
+                    <a:noFill/>
+                    <a:ln w="9525">
+                      <a:noFill/>
+                      <a:headEnd/>
+                      <a:tailEnd/>
+                    </a:ln>
+                  </pic:spPr>
+                </pic:pic>
+              </a:graphicData>
+            </a:graphic>
+          </wp:inline>
+        </w:drawing>
+      </w:r>
+    </w:p>
+    <w:p>
+      <w:pPr>
+        <w:pStyle w:val="ImageCaption"/>
+      </w:pPr>
+      <w:r>
+        <w:t xml:space="preserve">Sechs Bedrohungsklassen und was sie dem System nehmen</w:t>
+      </w:r>
+    </w:p>
+    <w:bookmarkEnd w:id="28"/>
+    <w:bookmarkEnd w:id="29"/>
+    <w:bookmarkStart w:id="30" w:name="X8e67052230c26c30451e415e83a921517a6173e"/>
     <w:p>
       <w:pPr>
         <w:pStyle w:val="Heading1"/>
@@ -1053,8 +1108,8 @@
         <w:t xml:space="preserve">Nicht die Bedrohung wird kontrolliert — sondern die Fähigkeit, ihren Effekt zu absorbieren.</w:t>
       </w:r>
     </w:p>
-    <w:bookmarkEnd w:id="27"/>
-    <w:bookmarkStart w:id="34" w:name="X61c7eec27a02ef9a2db21ce09446572715f378f"/>
+    <w:bookmarkEnd w:id="30"/>
+    <w:bookmarkStart w:id="79" w:name="X61c7eec27a02ef9a2db21ce09446572715f378f"/>
     <w:p>
       <w:pPr>
         <w:pStyle w:val="Heading1"/>
@@ -1087,7 +1142,7 @@
         <w:t xml:space="preserve">im Gegensatz zu reiner Prävention.</w:t>
       </w:r>
     </w:p>
-    <w:bookmarkStart w:id="28" w:name="ransomware-destruktive-angriffe"/>
+    <w:bookmarkStart w:id="38" w:name="ransomware-destruktive-angriffe"/>
     <w:p>
       <w:pPr>
         <w:pStyle w:val="Heading2"/>
@@ -1177,8 +1232,220 @@
         <w:t xml:space="preserve">Wiederherstellbarkeit &gt; Prävention (vgl. ISO/IEC 27031; BSI-200-4: testing over documentation)</w:t>
       </w:r>
     </w:p>
-    <w:bookmarkEnd w:id="28"/>
-    <w:bookmarkStart w:id="29" w:name="ddos-lastangriffe"/>
+    <w:tbl>
+      <w:tblPr>
+        <w:tblStyle w:val="Table"/>
+        <w:tblLook w:firstRow="0" w:lastRow="0" w:firstColumn="0" w:lastColumn="0" w:noHBand="0" w:noVBand="0" w:val="0000"/>
+        <w:tblBorders>
+          <w:top w:val="single" w:sz="4" w:space="0" w:color="00A047"/>
+          <w:left w:val="single" w:sz="24" w:space="0" w:color="00A047"/>
+          <w:bottom w:val="single" w:sz="4" w:space="0" w:color="00A047"/>
+          <w:right w:val="single" w:sz="4" w:space="0" w:color="00A047"/>
+        </w:tblBorders>
+        <w:tblCellMar>
+          <w:left w:w="144" w:type="dxa"/>
+          <w:right w:w="144" w:type="dxa"/>
+        </w:tblCellMar>
+        <w:tblLook w:firstRow="0" w:lastRow="0" w:firstColumn="0" w:lastColumn="0" w:noHBand="0" w:noVBand="0" w:val="0000"/>
+      </w:tblPr>
+      <w:tr>
+        <w:trPr>
+          <w:cantSplit/>
+        </w:trPr>
+        <w:tc>
+          <w:tcPr>
+            <w:shd w:color="auto" w:fill="ccf1e3" w:val="clear"/>
+            <w:tcMar>
+              <w:top w:w="92" w:type="dxa"/>
+              <w:bottom w:w="92" w:type="dxa"/>
+            </w:tcMar>
+          </w:tcPr>
+          <w:p>
+            <w:pPr>
+              <w:pStyle w:val="BodyText"/>
+            </w:pPr>
+            <w:pPr>
+              <w:spacing w:before="0" w:after="0"/>
+              <w:textAlignment w:val="center"/>
+            </w:pPr>
+            <w:r>
+              <w:drawing>
+                <wp:inline>
+                  <wp:extent cx="152400" cy="152400"/>
+                  <wp:effectExtent b="0" l="0" r="0" t="0"/>
+                  <wp:docPr descr="" title="" id="32" name="Picture"/>
+                  <a:graphic>
+                    <a:graphicData uri="http://schemas.openxmlformats.org/drawingml/2006/picture">
+                      <pic:pic>
+                        <pic:nvPicPr>
+                          <pic:cNvPr descr="/usr/local/lib/python3.13/dist-packages/quarto_cli/share/formats/docx/tip.png" id="33" name="Picture"/>
+                          <pic:cNvPicPr>
+                            <a:picLocks noChangeArrowheads="1" noChangeAspect="1"/>
+                          </pic:cNvPicPr>
+                        </pic:nvPicPr>
+                        <pic:blipFill>
+                          <a:blip r:embed="rId31"/>
+                          <a:stretch>
+                            <a:fillRect/>
+                          </a:stretch>
+                        </pic:blipFill>
+                        <pic:spPr bwMode="auto">
+                          <a:xfrm>
+                            <a:off x="0" y="0"/>
+                            <a:ext cx="152400" cy="152400"/>
+                          </a:xfrm>
+                          <a:prstGeom prst="rect">
+                            <a:avLst/>
+                          </a:prstGeom>
+                          <a:noFill/>
+                          <a:ln w="9525">
+                            <a:noFill/>
+                            <a:headEnd/>
+                            <a:tailEnd/>
+                          </a:ln>
+                        </pic:spPr>
+                      </pic:pic>
+                    </a:graphicData>
+                  </a:graphic>
+                </wp:inline>
+              </w:drawing>
+            </w:r>
+            <w:r>
+              <w:t xml:space="preserve"> </w:t>
+            </w:r>
+            <w:r>
+              <w:t xml:space="preserve"> </w:t>
+            </w:r>
+            <w:r>
+              <w:t xml:space="preserve">Ergänzung zur Vorlesung: Hochschule Mainz 2025</w:t>
+            </w:r>
+          </w:p>
+        </w:tc>
+      </w:tr>
+      <w:tr>
+        <w:trPr>
+          <w:cantSplit/>
+        </w:trPr>
+        <w:tc>
+          <w:tcPr>
+            <w:tcMar>
+              <w:top w:w="108" w:type="dxa"/>
+              <w:bottom w:w="108" w:type="dxa"/>
+            </w:tcMar>
+          </w:tcPr>
+          <w:p>
+            <w:pPr>
+              <w:pStyle w:val="BodyText"/>
+            </w:pPr>
+            <w:pPr>
+              <w:spacing w:before="16"/>
+            </w:pPr>
+            <w:r>
+              <w:t xml:space="preserve">Am 24. November 2025 fuhr die Hochschule Mainz nach einem Cyberangriff ihre IT-Systeme herunter. E-Mail war nur eingeschränkt nutzbar, die Ermittlungsbehörden wurden eingebunden, und ein Krisenstab sollte Studierende und Beschäftigte arbeitsfähig halten. Die Präsenzlehre lief weiter; informiert wurde über die Campus2Go-App, Instagram und LinkedIn.</w:t>
+            </w:r>
+          </w:p>
+          <w:p>
+            <w:pPr>
+              <w:pStyle w:val="BodyText"/>
+            </w:pPr>
+            <w:r>
+              <w:t xml:space="preserve">Der Wiederaufbau folgte dem Muster der Clean-Room-Recovery: Alle Betroffenen erhielten neue Zugangsdaten, alle IT-verwalteten Geräte wurden eingesammelt und mit neuen System-Images ausgerollt – systemrelevante Bereiche zuerst. Die Zahlungsfähigkeit war vor Weihnachten wiederhergestellt, eduroam im Februar 2026 wieder an allen Standorten verfügbar. Viele Abläufe liefen über Monate mit höherem organisatorischem Aufwand.</w:t>
+            </w:r>
+          </w:p>
+          <w:p>
+            <w:pPr>
+              <w:pStyle w:val="BodyText"/>
+            </w:pPr>
+            <w:r>
+              <w:t xml:space="preserve">Der Fall zeigt zweierlei: Nach einem destruktiven Angriff heißt Recovery Neuaufbau statt Reparatur, und Resilienz misst sich zuerst an den Kernfunktionen, nicht an der vollständigen Normalität. Dargestellt sind ausschließlich die veröffentlichten Angaben der Hochschule.</w:t>
+            </w:r>
+          </w:p>
+          <w:p>
+            <w:pPr>
+              <w:pStyle w:val="BodyText"/>
+            </w:pPr>
+            <w:pPr>
+              <w:spacing w:after="16"/>
+            </w:pPr>
+            <w:r>
+              <w:t xml:space="preserve">Quellenangaben unter</w:t>
+            </w:r>
+            <w:r>
+              <w:t xml:space="preserve"> </w:t>
+            </w:r>
+            <w:hyperlink r:id="rId34">
+              <w:r>
+                <w:rPr>
+                  <w:rStyle w:val="Hyperlink"/>
+                </w:rPr>
+                <w:t xml:space="preserve">Quellen</w:t>
+              </w:r>
+            </w:hyperlink>
+            <w:r>
+              <w:t xml:space="preserve">.</w:t>
+            </w:r>
+          </w:p>
+          <w:p/>
+        </w:tc>
+      </w:tr>
+    </w:tbl>
+    <w:p>
+      <w:pPr>
+        <w:pStyle w:val="CaptionedFigure"/>
+      </w:pPr>
+      <w:r>
+        <w:drawing>
+          <wp:inline>
+            <wp:extent cx="4027170" cy="3068842"/>
+            <wp:effectExtent b="0" l="0" r="0" t="0"/>
+            <wp:docPr descr="Wiederaufbau an der Hochschule Mainz (veröffentlichte Angaben)" title="" id="36" name="Picture"/>
+            <a:graphic>
+              <a:graphicData uri="http://schemas.openxmlformats.org/drawingml/2006/picture">
+                <pic:pic>
+                  <pic:nvPicPr>
+                    <pic:cNvPr descr="../Präsentationen/Termin-04/assets/hsm-2025-wiederaufbau.png" id="37" name="Picture"/>
+                    <pic:cNvPicPr>
+                      <a:picLocks noChangeArrowheads="1" noChangeAspect="1"/>
+                    </pic:cNvPicPr>
+                  </pic:nvPicPr>
+                  <pic:blipFill>
+                    <a:blip r:embed="rId35"/>
+                    <a:stretch>
+                      <a:fillRect/>
+                    </a:stretch>
+                  </pic:blipFill>
+                  <pic:spPr bwMode="auto">
+                    <a:xfrm>
+                      <a:off x="0" y="0"/>
+                      <a:ext cx="4027170" cy="3068842"/>
+                    </a:xfrm>
+                    <a:prstGeom prst="rect">
+                      <a:avLst/>
+                    </a:prstGeom>
+                    <a:noFill/>
+                    <a:ln w="9525">
+                      <a:noFill/>
+                      <a:headEnd/>
+                      <a:tailEnd/>
+                    </a:ln>
+                  </pic:spPr>
+                </pic:pic>
+              </a:graphicData>
+            </a:graphic>
+          </wp:inline>
+        </w:drawing>
+      </w:r>
+    </w:p>
+    <w:p>
+      <w:pPr>
+        <w:pStyle w:val="ImageCaption"/>
+      </w:pPr>
+      <w:r>
+        <w:t xml:space="preserve">Wiederaufbau an der Hochschule Mainz (veröffentlichte Angaben)</w:t>
+      </w:r>
+    </w:p>
+    <w:bookmarkEnd w:id="38"/>
+    <w:bookmarkStart w:id="44" w:name="ddos-lastangriffe"/>
     <w:p>
       <w:pPr>
         <w:pStyle w:val="Heading2"/>
@@ -1284,8 +1551,212 @@
         <w:t xml:space="preserve">Adaptivität als Resilienzform (vgl. ENISA DDoS Best Practices)</w:t>
       </w:r>
     </w:p>
-    <w:bookmarkEnd w:id="29"/>
-    <w:bookmarkStart w:id="30" w:name="cloud-rz-ausfall"/>
+    <w:tbl>
+      <w:tblPr>
+        <w:tblStyle w:val="Table"/>
+        <w:tblLook w:firstRow="0" w:lastRow="0" w:firstColumn="0" w:lastColumn="0" w:noHBand="0" w:noVBand="0" w:val="0000"/>
+        <w:tblBorders>
+          <w:top w:val="single" w:sz="4" w:space="0" w:color="00A047"/>
+          <w:left w:val="single" w:sz="24" w:space="0" w:color="00A047"/>
+          <w:bottom w:val="single" w:sz="4" w:space="0" w:color="00A047"/>
+          <w:right w:val="single" w:sz="4" w:space="0" w:color="00A047"/>
+        </w:tblBorders>
+        <w:tblCellMar>
+          <w:left w:w="144" w:type="dxa"/>
+          <w:right w:w="144" w:type="dxa"/>
+        </w:tblCellMar>
+        <w:tblLook w:firstRow="0" w:lastRow="0" w:firstColumn="0" w:lastColumn="0" w:noHBand="0" w:noVBand="0" w:val="0000"/>
+      </w:tblPr>
+      <w:tr>
+        <w:trPr>
+          <w:cantSplit/>
+        </w:trPr>
+        <w:tc>
+          <w:tcPr>
+            <w:shd w:color="auto" w:fill="ccf1e3" w:val="clear"/>
+            <w:tcMar>
+              <w:top w:w="92" w:type="dxa"/>
+              <w:bottom w:w="92" w:type="dxa"/>
+            </w:tcMar>
+          </w:tcPr>
+          <w:p>
+            <w:pPr>
+              <w:pStyle w:val="BodyText"/>
+            </w:pPr>
+            <w:pPr>
+              <w:spacing w:before="0" w:after="0"/>
+              <w:textAlignment w:val="center"/>
+            </w:pPr>
+            <w:r>
+              <w:drawing>
+                <wp:inline>
+                  <wp:extent cx="152400" cy="152400"/>
+                  <wp:effectExtent b="0" l="0" r="0" t="0"/>
+                  <wp:docPr descr="" title="" id="39" name="Picture"/>
+                  <a:graphic>
+                    <a:graphicData uri="http://schemas.openxmlformats.org/drawingml/2006/picture">
+                      <pic:pic>
+                        <pic:nvPicPr>
+                          <pic:cNvPr descr="/usr/local/lib/python3.13/dist-packages/quarto_cli/share/formats/docx/tip.png" id="40" name="Picture"/>
+                          <pic:cNvPicPr>
+                            <a:picLocks noChangeArrowheads="1" noChangeAspect="1"/>
+                          </pic:cNvPicPr>
+                        </pic:nvPicPr>
+                        <pic:blipFill>
+                          <a:blip r:embed="rId31"/>
+                          <a:stretch>
+                            <a:fillRect/>
+                          </a:stretch>
+                        </pic:blipFill>
+                        <pic:spPr bwMode="auto">
+                          <a:xfrm>
+                            <a:off x="0" y="0"/>
+                            <a:ext cx="152400" cy="152400"/>
+                          </a:xfrm>
+                          <a:prstGeom prst="rect">
+                            <a:avLst/>
+                          </a:prstGeom>
+                          <a:noFill/>
+                          <a:ln w="9525">
+                            <a:noFill/>
+                            <a:headEnd/>
+                            <a:tailEnd/>
+                          </a:ln>
+                        </pic:spPr>
+                      </pic:pic>
+                    </a:graphicData>
+                  </a:graphic>
+                </wp:inline>
+              </w:drawing>
+            </w:r>
+            <w:r>
+              <w:t xml:space="preserve"> </w:t>
+            </w:r>
+            <w:r>
+              <w:t xml:space="preserve"> </w:t>
+            </w:r>
+            <w:r>
+              <w:t xml:space="preserve">Ergänzung zur Vorlesung: Dyn und das Mirai-Botnetz 2016</w:t>
+            </w:r>
+          </w:p>
+        </w:tc>
+      </w:tr>
+      <w:tr>
+        <w:trPr>
+          <w:cantSplit/>
+        </w:trPr>
+        <w:tc>
+          <w:tcPr>
+            <w:tcMar>
+              <w:top w:w="108" w:type="dxa"/>
+              <w:bottom w:w="108" w:type="dxa"/>
+            </w:tcMar>
+          </w:tcPr>
+          <w:p>
+            <w:pPr>
+              <w:pStyle w:val="BodyText"/>
+            </w:pPr>
+            <w:pPr>
+              <w:spacing w:before="16"/>
+            </w:pPr>
+            <w:r>
+              <w:t xml:space="preserve">Am 21. Oktober 2016 trafen zwei Angriffswellen den DNS-Anbieter Dyn, vor allem dessen Standorte an der US-Ostküste. Hauptquelle des Angriffsverkehrs war nach Dyns Analyse das Mirai-Botnetz aus gekaperten IoT-Geräten wie Kameras und Routern; Dyn schätzte bis zu 100.000 beteiligte Endpunkte. Ein Sturm legitimer Wiederholungsanfragen ließ den Angriff zusätzlich größer erscheinen. Dienste wie Twitter, Spotify und Reddit waren für viele Nutzer zeitweise nicht erreichbar.</w:t>
+            </w:r>
+          </w:p>
+          <w:p>
+            <w:pPr>
+              <w:pStyle w:val="BodyText"/>
+            </w:pPr>
+            <w:r>
+              <w:t xml:space="preserve">Die Webserver dieser Dienste waren intakt – nur ihre Namen ließen sich nicht mehr auflösen. Der Fall verbindet zwei Prinzipien: Adaptivität beim Anbieter (Scrubbing, Lastverteilung) und Diversität beim Kunden (ein zweiter, unabhängiger DNS-Anbieter).</w:t>
+            </w:r>
+          </w:p>
+          <w:p>
+            <w:pPr>
+              <w:pStyle w:val="BodyText"/>
+            </w:pPr>
+            <w:pPr>
+              <w:spacing w:after="16"/>
+            </w:pPr>
+            <w:r>
+              <w:t xml:space="preserve">Quellenangaben unter</w:t>
+            </w:r>
+            <w:r>
+              <w:t xml:space="preserve"> </w:t>
+            </w:r>
+            <w:hyperlink r:id="rId34">
+              <w:r>
+                <w:rPr>
+                  <w:rStyle w:val="Hyperlink"/>
+                </w:rPr>
+                <w:t xml:space="preserve">Quellen</w:t>
+              </w:r>
+            </w:hyperlink>
+            <w:r>
+              <w:t xml:space="preserve">.</w:t>
+            </w:r>
+          </w:p>
+          <w:p/>
+        </w:tc>
+      </w:tr>
+    </w:tbl>
+    <w:p>
+      <w:pPr>
+        <w:pStyle w:val="CaptionedFigure"/>
+      </w:pPr>
+      <w:r>
+        <w:drawing>
+          <wp:inline>
+            <wp:extent cx="4027170" cy="3068842"/>
+            <wp:effectExtent b="0" l="0" r="0" t="0"/>
+            <wp:docPr descr="Dyn 2016: ein DNS-Anbieter als gemeinsamer Fehlerpfad" title="" id="42" name="Picture"/>
+            <a:graphic>
+              <a:graphicData uri="http://schemas.openxmlformats.org/drawingml/2006/picture">
+                <pic:pic>
+                  <pic:nvPicPr>
+                    <pic:cNvPr descr="../Präsentationen/Termin-04/assets/dyn-2016-abhaengigkeit.png" id="43" name="Picture"/>
+                    <pic:cNvPicPr>
+                      <a:picLocks noChangeArrowheads="1" noChangeAspect="1"/>
+                    </pic:cNvPicPr>
+                  </pic:nvPicPr>
+                  <pic:blipFill>
+                    <a:blip r:embed="rId41"/>
+                    <a:stretch>
+                      <a:fillRect/>
+                    </a:stretch>
+                  </pic:blipFill>
+                  <pic:spPr bwMode="auto">
+                    <a:xfrm>
+                      <a:off x="0" y="0"/>
+                      <a:ext cx="4027170" cy="3068842"/>
+                    </a:xfrm>
+                    <a:prstGeom prst="rect">
+                      <a:avLst/>
+                    </a:prstGeom>
+                    <a:noFill/>
+                    <a:ln w="9525">
+                      <a:noFill/>
+                      <a:headEnd/>
+                      <a:tailEnd/>
+                    </a:ln>
+                  </pic:spPr>
+                </pic:pic>
+              </a:graphicData>
+            </a:graphic>
+          </wp:inline>
+        </w:drawing>
+      </w:r>
+    </w:p>
+    <w:p>
+      <w:pPr>
+        <w:pStyle w:val="ImageCaption"/>
+      </w:pPr>
+      <w:r>
+        <w:t xml:space="preserve">Dyn 2016: ein DNS-Anbieter als gemeinsamer Fehlerpfad</w:t>
+      </w:r>
+    </w:p>
+    <w:bookmarkEnd w:id="44"/>
+    <w:bookmarkStart w:id="55" w:name="cloud-rz-ausfall"/>
     <w:p>
       <w:pPr>
         <w:pStyle w:val="Heading2"/>
@@ -1375,8 +1846,432 @@
         <w:t xml:space="preserve">Redundanz + Entkopplung (vgl. NIST SP 800-160 Vol.2 „Diversity of Location“)</w:t>
       </w:r>
     </w:p>
-    <w:bookmarkEnd w:id="30"/>
-    <w:bookmarkStart w:id="31" w:name="identity-ausfall"/>
+    <w:tbl>
+      <w:tblPr>
+        <w:tblStyle w:val="Table"/>
+        <w:tblLook w:firstRow="0" w:lastRow="0" w:firstColumn="0" w:lastColumn="0" w:noHBand="0" w:noVBand="0" w:val="0000"/>
+        <w:tblBorders>
+          <w:top w:val="single" w:sz="4" w:space="0" w:color="00A047"/>
+          <w:left w:val="single" w:sz="24" w:space="0" w:color="00A047"/>
+          <w:bottom w:val="single" w:sz="4" w:space="0" w:color="00A047"/>
+          <w:right w:val="single" w:sz="4" w:space="0" w:color="00A047"/>
+        </w:tblBorders>
+        <w:tblCellMar>
+          <w:left w:w="144" w:type="dxa"/>
+          <w:right w:w="144" w:type="dxa"/>
+        </w:tblCellMar>
+        <w:tblLook w:firstRow="0" w:lastRow="0" w:firstColumn="0" w:lastColumn="0" w:noHBand="0" w:noVBand="0" w:val="0000"/>
+      </w:tblPr>
+      <w:tr>
+        <w:trPr>
+          <w:cantSplit/>
+        </w:trPr>
+        <w:tc>
+          <w:tcPr>
+            <w:shd w:color="auto" w:fill="ccf1e3" w:val="clear"/>
+            <w:tcMar>
+              <w:top w:w="92" w:type="dxa"/>
+              <w:bottom w:w="92" w:type="dxa"/>
+            </w:tcMar>
+          </w:tcPr>
+          <w:p>
+            <w:pPr>
+              <w:pStyle w:val="BodyText"/>
+            </w:pPr>
+            <w:pPr>
+              <w:spacing w:before="0" w:after="0"/>
+              <w:textAlignment w:val="center"/>
+            </w:pPr>
+            <w:r>
+              <w:drawing>
+                <wp:inline>
+                  <wp:extent cx="152400" cy="152400"/>
+                  <wp:effectExtent b="0" l="0" r="0" t="0"/>
+                  <wp:docPr descr="" title="" id="45" name="Picture"/>
+                  <a:graphic>
+                    <a:graphicData uri="http://schemas.openxmlformats.org/drawingml/2006/picture">
+                      <pic:pic>
+                        <pic:nvPicPr>
+                          <pic:cNvPr descr="/usr/local/lib/python3.13/dist-packages/quarto_cli/share/formats/docx/tip.png" id="46" name="Picture"/>
+                          <pic:cNvPicPr>
+                            <a:picLocks noChangeArrowheads="1" noChangeAspect="1"/>
+                          </pic:cNvPicPr>
+                        </pic:nvPicPr>
+                        <pic:blipFill>
+                          <a:blip r:embed="rId31"/>
+                          <a:stretch>
+                            <a:fillRect/>
+                          </a:stretch>
+                        </pic:blipFill>
+                        <pic:spPr bwMode="auto">
+                          <a:xfrm>
+                            <a:off x="0" y="0"/>
+                            <a:ext cx="152400" cy="152400"/>
+                          </a:xfrm>
+                          <a:prstGeom prst="rect">
+                            <a:avLst/>
+                          </a:prstGeom>
+                          <a:noFill/>
+                          <a:ln w="9525">
+                            <a:noFill/>
+                            <a:headEnd/>
+                            <a:tailEnd/>
+                          </a:ln>
+                        </pic:spPr>
+                      </pic:pic>
+                    </a:graphicData>
+                  </a:graphic>
+                </wp:inline>
+              </w:drawing>
+            </w:r>
+            <w:r>
+              <w:t xml:space="preserve"> </w:t>
+            </w:r>
+            <w:r>
+              <w:t xml:space="preserve"> </w:t>
+            </w:r>
+            <w:r>
+              <w:t xml:space="preserve">Ergänzung zur Vorlesung: KDZ Mainz und KGRZ Koblenz 2026</w:t>
+            </w:r>
+          </w:p>
+        </w:tc>
+      </w:tr>
+      <w:tr>
+        <w:trPr>
+          <w:cantSplit/>
+        </w:trPr>
+        <w:tc>
+          <w:tcPr>
+            <w:tcMar>
+              <w:top w:w="108" w:type="dxa"/>
+              <w:bottom w:w="108" w:type="dxa"/>
+            </w:tcMar>
+          </w:tcPr>
+          <w:p>
+            <w:pPr>
+              <w:pStyle w:val="BodyText"/>
+            </w:pPr>
+            <w:pPr>
+              <w:spacing w:before="16"/>
+            </w:pPr>
+            <w:r>
+              <w:t xml:space="preserve">Am 27. September 2026 schalteten die kommunalen Rechenzentren KDZ Mainz und KGRZ Koblenz, die Betriebszentren des Zweckverbands ZIDKOR, zentrale Fachverfahren vorsorglich ab. Anlass waren kritische Sicherheitslücken in Citrix NetScaler. Betroffen waren alle 194 hauptamtlich geführten Städte, Gemeinden und Kreise in Rheinland-Pfalz: Einwohnermeldeämter, Pass- und Ausweisstellen, Kfz-Zulassung, Standesämter, Waffenbehörden und Schulverwaltungsprogramme. Das Land schaltete zusätzlich über Citrix erreichbare Dienste des Landesnetzes ab. Am 29. September waren die Verfahren nach Updates und Prüfung wieder verfügbar; nach Angaben der Betreiber gab es keinen erfolgreichen Angriff.</w:t>
+            </w:r>
+          </w:p>
+          <w:p>
+            <w:pPr>
+              <w:pStyle w:val="BodyText"/>
+            </w:pPr>
+            <w:r>
+              <w:t xml:space="preserve">Der Fall zeigt das</w:t>
+            </w:r>
+            <w:r>
+              <w:t xml:space="preserve"> </w:t>
+            </w:r>
+            <w:r>
+              <w:rPr>
+                <w:b/>
+                <w:bCs/>
+              </w:rPr>
+              <w:t xml:space="preserve">Konzentrationsrisiko</w:t>
+            </w:r>
+            <w:r>
+              <w:t xml:space="preserve"> </w:t>
+            </w:r>
+            <w:r>
+              <w:t xml:space="preserve">gemeinsamer Dienstleister: Zentralisierung macht einen professionellen Betrieb für kleine Verwaltungen erst möglich – und bündelt zugleich das Ausfallrisiko.</w:t>
+            </w:r>
+          </w:p>
+          <w:p>
+            <w:pPr>
+              <w:pStyle w:val="BodyText"/>
+            </w:pPr>
+            <w:pPr>
+              <w:spacing w:after="16"/>
+            </w:pPr>
+            <w:r>
+              <w:t xml:space="preserve">Quellenangaben unter</w:t>
+            </w:r>
+            <w:r>
+              <w:t xml:space="preserve"> </w:t>
+            </w:r>
+            <w:hyperlink r:id="rId34">
+              <w:r>
+                <w:rPr>
+                  <w:rStyle w:val="Hyperlink"/>
+                </w:rPr>
+                <w:t xml:space="preserve">Quellen</w:t>
+              </w:r>
+            </w:hyperlink>
+            <w:r>
+              <w:t xml:space="preserve">.</w:t>
+            </w:r>
+          </w:p>
+          <w:p/>
+        </w:tc>
+      </w:tr>
+    </w:tbl>
+    <w:p>
+      <w:pPr>
+        <w:pStyle w:val="CaptionedFigure"/>
+      </w:pPr>
+      <w:r>
+        <w:drawing>
+          <wp:inline>
+            <wp:extent cx="4027170" cy="3068842"/>
+            <wp:effectExtent b="0" l="0" r="0" t="0"/>
+            <wp:docPr descr="KDZ/KGRZ 2026: ein gemeinsamer Dienstleister, 194 Verwaltungen" title="" id="48" name="Picture"/>
+            <a:graphic>
+              <a:graphicData uri="http://schemas.openxmlformats.org/drawingml/2006/picture">
+                <pic:pic>
+                  <pic:nvPicPr>
+                    <pic:cNvPr descr="../Präsentationen/Termin-04/assets/zidkor-2026-konzentration.png" id="49" name="Picture"/>
+                    <pic:cNvPicPr>
+                      <a:picLocks noChangeArrowheads="1" noChangeAspect="1"/>
+                    </pic:cNvPicPr>
+                  </pic:nvPicPr>
+                  <pic:blipFill>
+                    <a:blip r:embed="rId47"/>
+                    <a:stretch>
+                      <a:fillRect/>
+                    </a:stretch>
+                  </pic:blipFill>
+                  <pic:spPr bwMode="auto">
+                    <a:xfrm>
+                      <a:off x="0" y="0"/>
+                      <a:ext cx="4027170" cy="3068842"/>
+                    </a:xfrm>
+                    <a:prstGeom prst="rect">
+                      <a:avLst/>
+                    </a:prstGeom>
+                    <a:noFill/>
+                    <a:ln w="9525">
+                      <a:noFill/>
+                      <a:headEnd/>
+                      <a:tailEnd/>
+                    </a:ln>
+                  </pic:spPr>
+                </pic:pic>
+              </a:graphicData>
+            </a:graphic>
+          </wp:inline>
+        </w:drawing>
+      </w:r>
+    </w:p>
+    <w:p>
+      <w:pPr>
+        <w:pStyle w:val="ImageCaption"/>
+      </w:pPr>
+      <w:r>
+        <w:t xml:space="preserve">KDZ/KGRZ 2026: ein gemeinsamer Dienstleister, 194 Verwaltungen</w:t>
+      </w:r>
+    </w:p>
+    <w:tbl>
+      <w:tblPr>
+        <w:tblStyle w:val="Table"/>
+        <w:tblLook w:firstRow="0" w:lastRow="0" w:firstColumn="0" w:lastColumn="0" w:noHBand="0" w:noVBand="0" w:val="0000"/>
+        <w:tblBorders>
+          <w:top w:val="single" w:sz="4" w:space="0" w:color="00A047"/>
+          <w:left w:val="single" w:sz="24" w:space="0" w:color="00A047"/>
+          <w:bottom w:val="single" w:sz="4" w:space="0" w:color="00A047"/>
+          <w:right w:val="single" w:sz="4" w:space="0" w:color="00A047"/>
+        </w:tblBorders>
+        <w:tblCellMar>
+          <w:left w:w="144" w:type="dxa"/>
+          <w:right w:w="144" w:type="dxa"/>
+        </w:tblCellMar>
+        <w:tblLook w:firstRow="0" w:lastRow="0" w:firstColumn="0" w:lastColumn="0" w:noHBand="0" w:noVBand="0" w:val="0000"/>
+      </w:tblPr>
+      <w:tr>
+        <w:trPr>
+          <w:cantSplit/>
+        </w:trPr>
+        <w:tc>
+          <w:tcPr>
+            <w:shd w:color="auto" w:fill="ccf1e3" w:val="clear"/>
+            <w:tcMar>
+              <w:top w:w="92" w:type="dxa"/>
+              <w:bottom w:w="92" w:type="dxa"/>
+            </w:tcMar>
+          </w:tcPr>
+          <w:p>
+            <w:pPr>
+              <w:pStyle w:val="BodyText"/>
+            </w:pPr>
+            <w:pPr>
+              <w:spacing w:before="0" w:after="0"/>
+              <w:textAlignment w:val="center"/>
+            </w:pPr>
+            <w:r>
+              <w:drawing>
+                <wp:inline>
+                  <wp:extent cx="152400" cy="152400"/>
+                  <wp:effectExtent b="0" l="0" r="0" t="0"/>
+                  <wp:docPr descr="" title="" id="50" name="Picture"/>
+                  <a:graphic>
+                    <a:graphicData uri="http://schemas.openxmlformats.org/drawingml/2006/picture">
+                      <pic:pic>
+                        <pic:nvPicPr>
+                          <pic:cNvPr descr="/usr/local/lib/python3.13/dist-packages/quarto_cli/share/formats/docx/tip.png" id="51" name="Picture"/>
+                          <pic:cNvPicPr>
+                            <a:picLocks noChangeArrowheads="1" noChangeAspect="1"/>
+                          </pic:cNvPicPr>
+                        </pic:nvPicPr>
+                        <pic:blipFill>
+                          <a:blip r:embed="rId31"/>
+                          <a:stretch>
+                            <a:fillRect/>
+                          </a:stretch>
+                        </pic:blipFill>
+                        <pic:spPr bwMode="auto">
+                          <a:xfrm>
+                            <a:off x="0" y="0"/>
+                            <a:ext cx="152400" cy="152400"/>
+                          </a:xfrm>
+                          <a:prstGeom prst="rect">
+                            <a:avLst/>
+                          </a:prstGeom>
+                          <a:noFill/>
+                          <a:ln w="9525">
+                            <a:noFill/>
+                            <a:headEnd/>
+                            <a:tailEnd/>
+                          </a:ln>
+                        </pic:spPr>
+                      </pic:pic>
+                    </a:graphicData>
+                  </a:graphic>
+                </wp:inline>
+              </w:drawing>
+            </w:r>
+            <w:r>
+              <w:t xml:space="preserve"> </w:t>
+            </w:r>
+            <w:r>
+              <w:t xml:space="preserve"> </w:t>
+            </w:r>
+            <w:r>
+              <w:t xml:space="preserve">Ergänzung zur Vorlesung: Vorsorgliches Abschalten als Resilienzentscheidung</w:t>
+            </w:r>
+          </w:p>
+        </w:tc>
+      </w:tr>
+      <w:tr>
+        <w:trPr>
+          <w:cantSplit/>
+        </w:trPr>
+        <w:tc>
+          <w:tcPr>
+            <w:tcMar>
+              <w:top w:w="108" w:type="dxa"/>
+              <w:bottom w:w="108" w:type="dxa"/>
+            </w:tcMar>
+          </w:tcPr>
+          <w:p>
+            <w:pPr>
+              <w:pStyle w:val="BodyText"/>
+            </w:pPr>
+            <w:pPr>
+              <w:spacing w:before="16"/>
+            </w:pPr>
+            <w:r>
+              <w:t xml:space="preserve">Eine bekannte, kritische Lücke stellt Betreiber vor eine Abwägung. Läuft der Dienst weiter, bleibt er verfügbar, trägt aber ein offenes Risiko – im schlimmsten Fall Einbruch, Datenabfluss und ein Wiederaufbau über Wochen. Wird er vorsorglich abgeschaltet, entsteht ein geplanter Ausfall mit absehbarer Dauer. Bezogen auf die Resilienzkurve aus Sitzung 2 wird bewusst ein kleiner, kurzer Einbruch in Kauf genommen, um einen tiefen und langen zu vermeiden.</w:t>
+            </w:r>
+          </w:p>
+          <w:p>
+            <w:pPr>
+              <w:pStyle w:val="BodyText"/>
+            </w:pPr>
+            <w:r>
+              <w:t xml:space="preserve">Voraussetzung sind ein vorbereiteter Notbetrieb und klare Entscheidungsrechte. Ein Beispiel für abgestufte Wirkung: Am 21. Oktober 2026 nahm die Stadt Mainz wegen einer kritischen PHP-Lücke ihre Website und weitere Internetdienste vom Netz, während Ämter, Telefon und E-Mail weiterliefen.</w:t>
+            </w:r>
+          </w:p>
+          <w:p>
+            <w:pPr>
+              <w:pStyle w:val="BodyText"/>
+            </w:pPr>
+            <w:pPr>
+              <w:spacing w:after="16"/>
+            </w:pPr>
+            <w:r>
+              <w:t xml:space="preserve">Quellenangaben unter</w:t>
+            </w:r>
+            <w:r>
+              <w:t xml:space="preserve"> </w:t>
+            </w:r>
+            <w:hyperlink r:id="rId34">
+              <w:r>
+                <w:rPr>
+                  <w:rStyle w:val="Hyperlink"/>
+                </w:rPr>
+                <w:t xml:space="preserve">Quellen</w:t>
+              </w:r>
+            </w:hyperlink>
+            <w:r>
+              <w:t xml:space="preserve">.</w:t>
+            </w:r>
+          </w:p>
+          <w:p/>
+        </w:tc>
+      </w:tr>
+    </w:tbl>
+    <w:p>
+      <w:pPr>
+        <w:pStyle w:val="CaptionedFigure"/>
+      </w:pPr>
+      <w:r>
+        <w:drawing>
+          <wp:inline>
+            <wp:extent cx="3451860" cy="2630436"/>
+            <wp:effectExtent b="0" l="0" r="0" t="0"/>
+            <wp:docPr descr="Weiterlaufen oder vorsorglich abschalten" title="" id="53" name="Picture"/>
+            <a:graphic>
+              <a:graphicData uri="http://schemas.openxmlformats.org/drawingml/2006/picture">
+                <pic:pic>
+                  <pic:nvPicPr>
+                    <pic:cNvPr descr="../Präsentationen/Termin-04/assets/abschalten-abwaegung.png" id="54" name="Picture"/>
+                    <pic:cNvPicPr>
+                      <a:picLocks noChangeArrowheads="1" noChangeAspect="1"/>
+                    </pic:cNvPicPr>
+                  </pic:nvPicPr>
+                  <pic:blipFill>
+                    <a:blip r:embed="rId52"/>
+                    <a:stretch>
+                      <a:fillRect/>
+                    </a:stretch>
+                  </pic:blipFill>
+                  <pic:spPr bwMode="auto">
+                    <a:xfrm>
+                      <a:off x="0" y="0"/>
+                      <a:ext cx="3451860" cy="2630436"/>
+                    </a:xfrm>
+                    <a:prstGeom prst="rect">
+                      <a:avLst/>
+                    </a:prstGeom>
+                    <a:noFill/>
+                    <a:ln w="9525">
+                      <a:noFill/>
+                      <a:headEnd/>
+                      <a:tailEnd/>
+                    </a:ln>
+                  </pic:spPr>
+                </pic:pic>
+              </a:graphicData>
+            </a:graphic>
+          </wp:inline>
+        </w:drawing>
+      </w:r>
+    </w:p>
+    <w:p>
+      <w:pPr>
+        <w:pStyle w:val="ImageCaption"/>
+      </w:pPr>
+      <w:r>
+        <w:t xml:space="preserve">Weiterlaufen oder vorsorglich abschalten</w:t>
+      </w:r>
+    </w:p>
+    <w:bookmarkEnd w:id="55"/>
+    <w:bookmarkStart w:id="61" w:name="identity-ausfall"/>
     <w:p>
       <w:pPr>
         <w:pStyle w:val="Heading2"/>
@@ -1479,8 +2374,212 @@
         <w:t xml:space="preserve">Diversität + Recovery (vgl. Zero Trust Architecture — Reduktion globaler Kopplungspunkte)</w:t>
       </w:r>
     </w:p>
-    <w:bookmarkEnd w:id="31"/>
-    <w:bookmarkStart w:id="32" w:name="human-failure-fehlkonfiguration"/>
+    <w:tbl>
+      <w:tblPr>
+        <w:tblStyle w:val="Table"/>
+        <w:tblLook w:firstRow="0" w:lastRow="0" w:firstColumn="0" w:lastColumn="0" w:noHBand="0" w:noVBand="0" w:val="0000"/>
+        <w:tblBorders>
+          <w:top w:val="single" w:sz="4" w:space="0" w:color="00A047"/>
+          <w:left w:val="single" w:sz="24" w:space="0" w:color="00A047"/>
+          <w:bottom w:val="single" w:sz="4" w:space="0" w:color="00A047"/>
+          <w:right w:val="single" w:sz="4" w:space="0" w:color="00A047"/>
+        </w:tblBorders>
+        <w:tblCellMar>
+          <w:left w:w="144" w:type="dxa"/>
+          <w:right w:w="144" w:type="dxa"/>
+        </w:tblCellMar>
+        <w:tblLook w:firstRow="0" w:lastRow="0" w:firstColumn="0" w:lastColumn="0" w:noHBand="0" w:noVBand="0" w:val="0000"/>
+      </w:tblPr>
+      <w:tr>
+        <w:trPr>
+          <w:cantSplit/>
+        </w:trPr>
+        <w:tc>
+          <w:tcPr>
+            <w:shd w:color="auto" w:fill="ccf1e3" w:val="clear"/>
+            <w:tcMar>
+              <w:top w:w="92" w:type="dxa"/>
+              <w:bottom w:w="92" w:type="dxa"/>
+            </w:tcMar>
+          </w:tcPr>
+          <w:p>
+            <w:pPr>
+              <w:pStyle w:val="BodyText"/>
+            </w:pPr>
+            <w:pPr>
+              <w:spacing w:before="0" w:after="0"/>
+              <w:textAlignment w:val="center"/>
+            </w:pPr>
+            <w:r>
+              <w:drawing>
+                <wp:inline>
+                  <wp:extent cx="152400" cy="152400"/>
+                  <wp:effectExtent b="0" l="0" r="0" t="0"/>
+                  <wp:docPr descr="" title="" id="56" name="Picture"/>
+                  <a:graphic>
+                    <a:graphicData uri="http://schemas.openxmlformats.org/drawingml/2006/picture">
+                      <pic:pic>
+                        <pic:nvPicPr>
+                          <pic:cNvPr descr="/usr/local/lib/python3.13/dist-packages/quarto_cli/share/formats/docx/tip.png" id="57" name="Picture"/>
+                          <pic:cNvPicPr>
+                            <a:picLocks noChangeArrowheads="1" noChangeAspect="1"/>
+                          </pic:cNvPicPr>
+                        </pic:nvPicPr>
+                        <pic:blipFill>
+                          <a:blip r:embed="rId31"/>
+                          <a:stretch>
+                            <a:fillRect/>
+                          </a:stretch>
+                        </pic:blipFill>
+                        <pic:spPr bwMode="auto">
+                          <a:xfrm>
+                            <a:off x="0" y="0"/>
+                            <a:ext cx="152400" cy="152400"/>
+                          </a:xfrm>
+                          <a:prstGeom prst="rect">
+                            <a:avLst/>
+                          </a:prstGeom>
+                          <a:noFill/>
+                          <a:ln w="9525">
+                            <a:noFill/>
+                            <a:headEnd/>
+                            <a:tailEnd/>
+                          </a:ln>
+                        </pic:spPr>
+                      </pic:pic>
+                    </a:graphicData>
+                  </a:graphic>
+                </wp:inline>
+              </w:drawing>
+            </w:r>
+            <w:r>
+              <w:t xml:space="preserve"> </w:t>
+            </w:r>
+            <w:r>
+              <w:t xml:space="preserve"> </w:t>
+            </w:r>
+            <w:r>
+              <w:t xml:space="preserve">Ergänzung zur Vorlesung: Azure AD 2021</w:t>
+            </w:r>
+          </w:p>
+        </w:tc>
+      </w:tr>
+      <w:tr>
+        <w:trPr>
+          <w:cantSplit/>
+        </w:trPr>
+        <w:tc>
+          <w:tcPr>
+            <w:tcMar>
+              <w:top w:w="108" w:type="dxa"/>
+              <w:bottom w:w="108" w:type="dxa"/>
+            </w:tcMar>
+          </w:tcPr>
+          <w:p>
+            <w:pPr>
+              <w:pStyle w:val="BodyText"/>
+            </w:pPr>
+            <w:pPr>
+              <w:spacing w:before="16"/>
+            </w:pPr>
+            <w:r>
+              <w:t xml:space="preserve">Am 15. März 2021 entfernte ein automatischer Prozess bei Microsoft einen Signierschlüssel, der wegen einer Migration als „behalten“ markiert war; ein Fehler in der Automatik ignorierte diese Markierung. Ab etwa 19:00 UTC verwarfen Anwendungen die mit diesem Schlüssel signierten Tokens, Anmeldungen scheiterten. Betroffen waren unter anderem Teams, Exchange, SharePoint, das Azure-Portal, Xbox Live sowie Anwendungen Dritter, die Azure AD zur Anmeldung nutzen. Der Rollback erfolgte um 21:05 UTC, Restwirkungen hielten bis zum nächsten Morgen an.</w:t>
+            </w:r>
+          </w:p>
+          <w:p>
+            <w:pPr>
+              <w:pStyle w:val="BodyText"/>
+            </w:pPr>
+            <w:r>
+              <w:t xml:space="preserve">Bemerkenswert: Die vorhandene Backup-Authentisierung half nicht, weil sie die Ausgabe von Tokens abdeckte, nicht ihre Prüfung. Eine Rückfallebene muss genau den Fehlerfall abdecken, der eintritt. Der Fall zeigt Identity als globalen Fail-Knopf – die Systeme liefen, nur der Zugang nicht.</w:t>
+            </w:r>
+          </w:p>
+          <w:p>
+            <w:pPr>
+              <w:pStyle w:val="BodyText"/>
+            </w:pPr>
+            <w:pPr>
+              <w:spacing w:after="16"/>
+            </w:pPr>
+            <w:r>
+              <w:t xml:space="preserve">Quellenangaben unter</w:t>
+            </w:r>
+            <w:r>
+              <w:t xml:space="preserve"> </w:t>
+            </w:r>
+            <w:hyperlink r:id="rId34">
+              <w:r>
+                <w:rPr>
+                  <w:rStyle w:val="Hyperlink"/>
+                </w:rPr>
+                <w:t xml:space="preserve">Quellen</w:t>
+              </w:r>
+            </w:hyperlink>
+            <w:r>
+              <w:t xml:space="preserve">.</w:t>
+            </w:r>
+          </w:p>
+          <w:p/>
+        </w:tc>
+      </w:tr>
+    </w:tbl>
+    <w:p>
+      <w:pPr>
+        <w:pStyle w:val="CaptionedFigure"/>
+      </w:pPr>
+      <w:r>
+        <w:drawing>
+          <wp:inline>
+            <wp:extent cx="4027170" cy="3068842"/>
+            <wp:effectExtent b="0" l="0" r="0" t="0"/>
+            <wp:docPr descr="Azure AD 2021: Systeme intakt, Anmeldung unmöglich" title="" id="59" name="Picture"/>
+            <a:graphic>
+              <a:graphicData uri="http://schemas.openxmlformats.org/drawingml/2006/picture">
+                <pic:pic>
+                  <pic:nvPicPr>
+                    <pic:cNvPr descr="../Präsentationen/Termin-04/assets/azure-ad-2021-kette.png" id="60" name="Picture"/>
+                    <pic:cNvPicPr>
+                      <a:picLocks noChangeArrowheads="1" noChangeAspect="1"/>
+                    </pic:cNvPicPr>
+                  </pic:nvPicPr>
+                  <pic:blipFill>
+                    <a:blip r:embed="rId58"/>
+                    <a:stretch>
+                      <a:fillRect/>
+                    </a:stretch>
+                  </pic:blipFill>
+                  <pic:spPr bwMode="auto">
+                    <a:xfrm>
+                      <a:off x="0" y="0"/>
+                      <a:ext cx="4027170" cy="3068842"/>
+                    </a:xfrm>
+                    <a:prstGeom prst="rect">
+                      <a:avLst/>
+                    </a:prstGeom>
+                    <a:noFill/>
+                    <a:ln w="9525">
+                      <a:noFill/>
+                      <a:headEnd/>
+                      <a:tailEnd/>
+                    </a:ln>
+                  </pic:spPr>
+                </pic:pic>
+              </a:graphicData>
+            </a:graphic>
+          </wp:inline>
+        </w:drawing>
+      </w:r>
+    </w:p>
+    <w:p>
+      <w:pPr>
+        <w:pStyle w:val="ImageCaption"/>
+      </w:pPr>
+      <w:r>
+        <w:t xml:space="preserve">Azure AD 2021: Systeme intakt, Anmeldung unmöglich</w:t>
+      </w:r>
+    </w:p>
+    <w:bookmarkEnd w:id="61"/>
+    <w:bookmarkStart w:id="67" w:name="human-failure-fehlkonfiguration"/>
     <w:p>
       <w:pPr>
         <w:pStyle w:val="Heading2"/>
@@ -1570,8 +2669,225 @@
         <w:t xml:space="preserve">Wiederherstellbarkeit + Governance (vgl. BSI-200-4 Reifegradstufen „gelernt vs. dokumentiert“)</w:t>
       </w:r>
     </w:p>
-    <w:bookmarkEnd w:id="32"/>
-    <w:bookmarkStart w:id="33" w:name="supply-chain-angriffe-1"/>
+    <w:tbl>
+      <w:tblPr>
+        <w:tblStyle w:val="Table"/>
+        <w:tblLook w:firstRow="0" w:lastRow="0" w:firstColumn="0" w:lastColumn="0" w:noHBand="0" w:noVBand="0" w:val="0000"/>
+        <w:tblBorders>
+          <w:top w:val="single" w:sz="4" w:space="0" w:color="00A047"/>
+          <w:left w:val="single" w:sz="24" w:space="0" w:color="00A047"/>
+          <w:bottom w:val="single" w:sz="4" w:space="0" w:color="00A047"/>
+          <w:right w:val="single" w:sz="4" w:space="0" w:color="00A047"/>
+        </w:tblBorders>
+        <w:tblCellMar>
+          <w:left w:w="144" w:type="dxa"/>
+          <w:right w:w="144" w:type="dxa"/>
+        </w:tblCellMar>
+        <w:tblLook w:firstRow="0" w:lastRow="0" w:firstColumn="0" w:lastColumn="0" w:noHBand="0" w:noVBand="0" w:val="0000"/>
+      </w:tblPr>
+      <w:tr>
+        <w:trPr>
+          <w:cantSplit/>
+        </w:trPr>
+        <w:tc>
+          <w:tcPr>
+            <w:shd w:color="auto" w:fill="ccf1e3" w:val="clear"/>
+            <w:tcMar>
+              <w:top w:w="92" w:type="dxa"/>
+              <w:bottom w:w="92" w:type="dxa"/>
+            </w:tcMar>
+          </w:tcPr>
+          <w:p>
+            <w:pPr>
+              <w:pStyle w:val="BodyText"/>
+            </w:pPr>
+            <w:pPr>
+              <w:spacing w:before="0" w:after="0"/>
+              <w:textAlignment w:val="center"/>
+            </w:pPr>
+            <w:r>
+              <w:drawing>
+                <wp:inline>
+                  <wp:extent cx="152400" cy="152400"/>
+                  <wp:effectExtent b="0" l="0" r="0" t="0"/>
+                  <wp:docPr descr="" title="" id="62" name="Picture"/>
+                  <a:graphic>
+                    <a:graphicData uri="http://schemas.openxmlformats.org/drawingml/2006/picture">
+                      <pic:pic>
+                        <pic:nvPicPr>
+                          <pic:cNvPr descr="/usr/local/lib/python3.13/dist-packages/quarto_cli/share/formats/docx/tip.png" id="63" name="Picture"/>
+                          <pic:cNvPicPr>
+                            <a:picLocks noChangeArrowheads="1" noChangeAspect="1"/>
+                          </pic:cNvPicPr>
+                        </pic:nvPicPr>
+                        <pic:blipFill>
+                          <a:blip r:embed="rId31"/>
+                          <a:stretch>
+                            <a:fillRect/>
+                          </a:stretch>
+                        </pic:blipFill>
+                        <pic:spPr bwMode="auto">
+                          <a:xfrm>
+                            <a:off x="0" y="0"/>
+                            <a:ext cx="152400" cy="152400"/>
+                          </a:xfrm>
+                          <a:prstGeom prst="rect">
+                            <a:avLst/>
+                          </a:prstGeom>
+                          <a:noFill/>
+                          <a:ln w="9525">
+                            <a:noFill/>
+                            <a:headEnd/>
+                            <a:tailEnd/>
+                          </a:ln>
+                        </pic:spPr>
+                      </pic:pic>
+                    </a:graphicData>
+                  </a:graphic>
+                </wp:inline>
+              </w:drawing>
+            </w:r>
+            <w:r>
+              <w:t xml:space="preserve"> </w:t>
+            </w:r>
+            <w:r>
+              <w:t xml:space="preserve"> </w:t>
+            </w:r>
+            <w:r>
+              <w:t xml:space="preserve">Ergänzung zur Vorlesung: AWS S3 2017</w:t>
+            </w:r>
+          </w:p>
+        </w:tc>
+      </w:tr>
+      <w:tr>
+        <w:trPr>
+          <w:cantSplit/>
+        </w:trPr>
+        <w:tc>
+          <w:tcPr>
+            <w:tcMar>
+              <w:top w:w="108" w:type="dxa"/>
+              <w:bottom w:w="108" w:type="dxa"/>
+            </w:tcMar>
+          </w:tcPr>
+          <w:p>
+            <w:pPr>
+              <w:pStyle w:val="BodyText"/>
+            </w:pPr>
+            <w:pPr>
+              <w:spacing w:before="16"/>
+            </w:pPr>
+            <w:r>
+              <w:t xml:space="preserve">Am 28. Februar 2017 wollte ein autorisierter Techniker bei AWS per Befehl wenige Server eines S3-Teilsystems entfernen. Eine Eingabe war falsch, und es fielen deutlich mehr Server weg. Zwei Kernsubsysteme mussten vollständig neu gestartet werden; S3 in der Region us-east-1 war von 9:37 bis 13:54 Uhr (Pacific Time) gestört, abhängige Dienste mit. Auch das Status-Dashboard hing an S3 und konnte lange nicht aktualisiert werden.</w:t>
+            </w:r>
+          </w:p>
+          <w:p>
+            <w:pPr>
+              <w:pStyle w:val="BodyText"/>
+            </w:pPr>
+            <w:r>
+              <w:t xml:space="preserve">AWS reagierte nicht mit Schuldzuweisung, sondern mit</w:t>
+            </w:r>
+            <w:r>
+              <w:t xml:space="preserve"> </w:t>
+            </w:r>
+            <w:r>
+              <w:rPr>
+                <w:b/>
+                <w:bCs/>
+              </w:rPr>
+              <w:t xml:space="preserve">Leitplanken im Werkzeug</w:t>
+            </w:r>
+            <w:r>
+              <w:t xml:space="preserve">: Kapazität wird nun langsamer und nie unter eine Mindestgrenze entfernt, weitere Werkzeuge wurden geprüft, das Index-Subsystem wird in kleinere Zellen aufgeteilt, und die Status-Konsole läuft in mehreren Regionen.</w:t>
+            </w:r>
+          </w:p>
+          <w:p>
+            <w:pPr>
+              <w:pStyle w:val="BodyText"/>
+            </w:pPr>
+            <w:pPr>
+              <w:spacing w:after="16"/>
+            </w:pPr>
+            <w:r>
+              <w:t xml:space="preserve">Quellenangaben unter</w:t>
+            </w:r>
+            <w:r>
+              <w:t xml:space="preserve"> </w:t>
+            </w:r>
+            <w:hyperlink r:id="rId34">
+              <w:r>
+                <w:rPr>
+                  <w:rStyle w:val="Hyperlink"/>
+                </w:rPr>
+                <w:t xml:space="preserve">Quellen</w:t>
+              </w:r>
+            </w:hyperlink>
+            <w:r>
+              <w:t xml:space="preserve">.</w:t>
+            </w:r>
+          </w:p>
+          <w:p/>
+        </w:tc>
+      </w:tr>
+    </w:tbl>
+    <w:p>
+      <w:pPr>
+        <w:pStyle w:val="CaptionedFigure"/>
+      </w:pPr>
+      <w:r>
+        <w:drawing>
+          <wp:inline>
+            <wp:extent cx="4027170" cy="2950913"/>
+            <wp:effectExtent b="0" l="0" r="0" t="0"/>
+            <wp:docPr descr="AWS S3 2017: Zeitleiste der Störung (Pacific Time)" title="" id="65" name="Picture"/>
+            <a:graphic>
+              <a:graphicData uri="http://schemas.openxmlformats.org/drawingml/2006/picture">
+                <pic:pic>
+                  <pic:nvPicPr>
+                    <pic:cNvPr descr="../Präsentationen/Termin-04/assets/s3-2017-zeitleiste.png" id="66" name="Picture"/>
+                    <pic:cNvPicPr>
+                      <a:picLocks noChangeArrowheads="1" noChangeAspect="1"/>
+                    </pic:cNvPicPr>
+                  </pic:nvPicPr>
+                  <pic:blipFill>
+                    <a:blip r:embed="rId64"/>
+                    <a:stretch>
+                      <a:fillRect/>
+                    </a:stretch>
+                  </pic:blipFill>
+                  <pic:spPr bwMode="auto">
+                    <a:xfrm>
+                      <a:off x="0" y="0"/>
+                      <a:ext cx="4027170" cy="2950913"/>
+                    </a:xfrm>
+                    <a:prstGeom prst="rect">
+                      <a:avLst/>
+                    </a:prstGeom>
+                    <a:noFill/>
+                    <a:ln w="9525">
+                      <a:noFill/>
+                      <a:headEnd/>
+                      <a:tailEnd/>
+                    </a:ln>
+                  </pic:spPr>
+                </pic:pic>
+              </a:graphicData>
+            </a:graphic>
+          </wp:inline>
+        </w:drawing>
+      </w:r>
+    </w:p>
+    <w:p>
+      <w:pPr>
+        <w:pStyle w:val="ImageCaption"/>
+      </w:pPr>
+      <w:r>
+        <w:t xml:space="preserve">AWS S3 2017: Zeitleiste der Störung (Pacific Time)</w:t>
+      </w:r>
+    </w:p>
+    <w:bookmarkEnd w:id="67"/>
+    <w:bookmarkStart w:id="78" w:name="supply-chain-angriffe-1"/>
     <w:p>
       <w:pPr>
         <w:pStyle w:val="Heading2"/>
@@ -1663,9 +2979,417 @@
         <w:t xml:space="preserve">Diversität + Isolation (vgl. ENISA Supply-Chain Risk Guidance)</w:t>
       </w:r>
     </w:p>
-    <w:bookmarkEnd w:id="33"/>
-    <w:bookmarkEnd w:id="34"/>
-    <w:bookmarkStart w:id="45" w:name="Xafd2a0671bf2af6a304171a611c42b61d054a02"/>
+    <w:tbl>
+      <w:tblPr>
+        <w:tblStyle w:val="Table"/>
+        <w:tblLook w:firstRow="0" w:lastRow="0" w:firstColumn="0" w:lastColumn="0" w:noHBand="0" w:noVBand="0" w:val="0000"/>
+        <w:tblBorders>
+          <w:top w:val="single" w:sz="4" w:space="0" w:color="00A047"/>
+          <w:left w:val="single" w:sz="24" w:space="0" w:color="00A047"/>
+          <w:bottom w:val="single" w:sz="4" w:space="0" w:color="00A047"/>
+          <w:right w:val="single" w:sz="4" w:space="0" w:color="00A047"/>
+        </w:tblBorders>
+        <w:tblCellMar>
+          <w:left w:w="144" w:type="dxa"/>
+          <w:right w:w="144" w:type="dxa"/>
+        </w:tblCellMar>
+        <w:tblLook w:firstRow="0" w:lastRow="0" w:firstColumn="0" w:lastColumn="0" w:noHBand="0" w:noVBand="0" w:val="0000"/>
+      </w:tblPr>
+      <w:tr>
+        <w:trPr>
+          <w:cantSplit/>
+        </w:trPr>
+        <w:tc>
+          <w:tcPr>
+            <w:shd w:color="auto" w:fill="ccf1e3" w:val="clear"/>
+            <w:tcMar>
+              <w:top w:w="92" w:type="dxa"/>
+              <w:bottom w:w="92" w:type="dxa"/>
+            </w:tcMar>
+          </w:tcPr>
+          <w:p>
+            <w:pPr>
+              <w:pStyle w:val="BodyText"/>
+            </w:pPr>
+            <w:pPr>
+              <w:spacing w:before="0" w:after="0"/>
+              <w:textAlignment w:val="center"/>
+            </w:pPr>
+            <w:r>
+              <w:drawing>
+                <wp:inline>
+                  <wp:extent cx="152400" cy="152400"/>
+                  <wp:effectExtent b="0" l="0" r="0" t="0"/>
+                  <wp:docPr descr="" title="" id="68" name="Picture"/>
+                  <a:graphic>
+                    <a:graphicData uri="http://schemas.openxmlformats.org/drawingml/2006/picture">
+                      <pic:pic>
+                        <pic:nvPicPr>
+                          <pic:cNvPr descr="/usr/local/lib/python3.13/dist-packages/quarto_cli/share/formats/docx/tip.png" id="69" name="Picture"/>
+                          <pic:cNvPicPr>
+                            <a:picLocks noChangeArrowheads="1" noChangeAspect="1"/>
+                          </pic:cNvPicPr>
+                        </pic:nvPicPr>
+                        <pic:blipFill>
+                          <a:blip r:embed="rId31"/>
+                          <a:stretch>
+                            <a:fillRect/>
+                          </a:stretch>
+                        </pic:blipFill>
+                        <pic:spPr bwMode="auto">
+                          <a:xfrm>
+                            <a:off x="0" y="0"/>
+                            <a:ext cx="152400" cy="152400"/>
+                          </a:xfrm>
+                          <a:prstGeom prst="rect">
+                            <a:avLst/>
+                          </a:prstGeom>
+                          <a:noFill/>
+                          <a:ln w="9525">
+                            <a:noFill/>
+                            <a:headEnd/>
+                            <a:tailEnd/>
+                          </a:ln>
+                        </pic:spPr>
+                      </pic:pic>
+                    </a:graphicData>
+                  </a:graphic>
+                </wp:inline>
+              </w:drawing>
+            </w:r>
+            <w:r>
+              <w:t xml:space="preserve"> </w:t>
+            </w:r>
+            <w:r>
+              <w:t xml:space="preserve"> </w:t>
+            </w:r>
+            <w:r>
+              <w:t xml:space="preserve">Ergänzung zur Vorlesung: Count+Care und die Mainzer Stadtwerke 2022</w:t>
+            </w:r>
+          </w:p>
+        </w:tc>
+      </w:tr>
+      <w:tr>
+        <w:trPr>
+          <w:cantSplit/>
+        </w:trPr>
+        <w:tc>
+          <w:tcPr>
+            <w:tcMar>
+              <w:top w:w="108" w:type="dxa"/>
+              <w:bottom w:w="108" w:type="dxa"/>
+            </w:tcMar>
+          </w:tcPr>
+          <w:p>
+            <w:pPr>
+              <w:pStyle w:val="BodyText"/>
+            </w:pPr>
+            <w:pPr>
+              <w:spacing w:before="16"/>
+            </w:pPr>
+            <w:r>
+              <w:t xml:space="preserve">Im Juni 2022 traf ein Ransomware-Angriff den IT-Dienstleister Count+Care, eine Tochter des Darmstädter Versorgers Entega. Mitbetroffen waren weitere Kunden, darunter die Mainzer Stadtwerke einschließlich Nahverkehr, die Frankfurter FES, die Darmstädter HEAG und Kommunen in Südhessen. Websites waren nicht erreichbar, tausende Beschäftigte kamen nicht an ihre E-Mail-Konten, im Nahverkehr kam es zu Ausfällen und eingeschränktem Ticketverkauf. Strom, Gas und Wasser liefen nach Angaben der Unternehmen weiter. Im Juli 2022 bestätigte Entega, dass die Täter personenbezogene Daten von Kunden, Beschäftigten und Geschäftspartnern veröffentlicht hatten.</w:t>
+            </w:r>
+          </w:p>
+          <w:p>
+            <w:pPr>
+              <w:pStyle w:val="BodyText"/>
+            </w:pPr>
+            <w:r>
+              <w:t xml:space="preserve">Der Angriff traf einen Dienstleister – ausgefallen sind viele Organisationen. Zugleich zeigt der Fall Graceful Degradation: Die Versorgung als Kernfunktion war von der Büro-IT getrennt und blieb in Betrieb.</w:t>
+            </w:r>
+          </w:p>
+          <w:p>
+            <w:pPr>
+              <w:pStyle w:val="BodyText"/>
+            </w:pPr>
+            <w:pPr>
+              <w:spacing w:after="16"/>
+            </w:pPr>
+            <w:r>
+              <w:t xml:space="preserve">Quellenangaben unter</w:t>
+            </w:r>
+            <w:r>
+              <w:t xml:space="preserve"> </w:t>
+            </w:r>
+            <w:hyperlink r:id="rId34">
+              <w:r>
+                <w:rPr>
+                  <w:rStyle w:val="Hyperlink"/>
+                </w:rPr>
+                <w:t xml:space="preserve">Quellen</w:t>
+              </w:r>
+            </w:hyperlink>
+            <w:r>
+              <w:t xml:space="preserve">.</w:t>
+            </w:r>
+          </w:p>
+          <w:p/>
+        </w:tc>
+      </w:tr>
+    </w:tbl>
+    <w:p>
+      <w:pPr>
+        <w:pStyle w:val="CaptionedFigure"/>
+      </w:pPr>
+      <w:r>
+        <w:drawing>
+          <wp:inline>
+            <wp:extent cx="4027170" cy="3072500"/>
+            <wp:effectExtent b="0" l="0" r="0" t="0"/>
+            <wp:docPr descr="Count+Care 2022: ein Dienstleister, viele Betroffene" title="" id="71" name="Picture"/>
+            <a:graphic>
+              <a:graphicData uri="http://schemas.openxmlformats.org/drawingml/2006/picture">
+                <pic:pic>
+                  <pic:nvPicPr>
+                    <pic:cNvPr descr="../Präsentationen/Termin-04/assets/countcare-2022-kunden.png" id="72" name="Picture"/>
+                    <pic:cNvPicPr>
+                      <a:picLocks noChangeArrowheads="1" noChangeAspect="1"/>
+                    </pic:cNvPicPr>
+                  </pic:nvPicPr>
+                  <pic:blipFill>
+                    <a:blip r:embed="rId70"/>
+                    <a:stretch>
+                      <a:fillRect/>
+                    </a:stretch>
+                  </pic:blipFill>
+                  <pic:spPr bwMode="auto">
+                    <a:xfrm>
+                      <a:off x="0" y="0"/>
+                      <a:ext cx="4027170" cy="3072500"/>
+                    </a:xfrm>
+                    <a:prstGeom prst="rect">
+                      <a:avLst/>
+                    </a:prstGeom>
+                    <a:noFill/>
+                    <a:ln w="9525">
+                      <a:noFill/>
+                      <a:headEnd/>
+                      <a:tailEnd/>
+                    </a:ln>
+                  </pic:spPr>
+                </pic:pic>
+              </a:graphicData>
+            </a:graphic>
+          </wp:inline>
+        </w:drawing>
+      </w:r>
+    </w:p>
+    <w:p>
+      <w:pPr>
+        <w:pStyle w:val="ImageCaption"/>
+      </w:pPr>
+      <w:r>
+        <w:t xml:space="preserve">Count+Care 2022: ein Dienstleister, viele Betroffene</w:t>
+      </w:r>
+    </w:p>
+    <w:tbl>
+      <w:tblPr>
+        <w:tblStyle w:val="Table"/>
+        <w:tblLook w:firstRow="0" w:lastRow="0" w:firstColumn="0" w:lastColumn="0" w:noHBand="0" w:noVBand="0" w:val="0000"/>
+        <w:tblBorders>
+          <w:top w:val="single" w:sz="4" w:space="0" w:color="00A047"/>
+          <w:left w:val="single" w:sz="24" w:space="0" w:color="00A047"/>
+          <w:bottom w:val="single" w:sz="4" w:space="0" w:color="00A047"/>
+          <w:right w:val="single" w:sz="4" w:space="0" w:color="00A047"/>
+        </w:tblBorders>
+        <w:tblCellMar>
+          <w:left w:w="144" w:type="dxa"/>
+          <w:right w:w="144" w:type="dxa"/>
+        </w:tblCellMar>
+        <w:tblLook w:firstRow="0" w:lastRow="0" w:firstColumn="0" w:lastColumn="0" w:noHBand="0" w:noVBand="0" w:val="0000"/>
+      </w:tblPr>
+      <w:tr>
+        <w:trPr>
+          <w:cantSplit/>
+        </w:trPr>
+        <w:tc>
+          <w:tcPr>
+            <w:shd w:color="auto" w:fill="ccf1e3" w:val="clear"/>
+            <w:tcMar>
+              <w:top w:w="92" w:type="dxa"/>
+              <w:bottom w:w="92" w:type="dxa"/>
+            </w:tcMar>
+          </w:tcPr>
+          <w:p>
+            <w:pPr>
+              <w:pStyle w:val="BodyText"/>
+            </w:pPr>
+            <w:pPr>
+              <w:spacing w:before="0" w:after="0"/>
+              <w:textAlignment w:val="center"/>
+            </w:pPr>
+            <w:r>
+              <w:drawing>
+                <wp:inline>
+                  <wp:extent cx="152400" cy="152400"/>
+                  <wp:effectExtent b="0" l="0" r="0" t="0"/>
+                  <wp:docPr descr="" title="" id="73" name="Picture"/>
+                  <a:graphic>
+                    <a:graphicData uri="http://schemas.openxmlformats.org/drawingml/2006/picture">
+                      <pic:pic>
+                        <pic:nvPicPr>
+                          <pic:cNvPr descr="/usr/local/lib/python3.13/dist-packages/quarto_cli/share/formats/docx/tip.png" id="74" name="Picture"/>
+                          <pic:cNvPicPr>
+                            <a:picLocks noChangeArrowheads="1" noChangeAspect="1"/>
+                          </pic:cNvPicPr>
+                        </pic:nvPicPr>
+                        <pic:blipFill>
+                          <a:blip r:embed="rId31"/>
+                          <a:stretch>
+                            <a:fillRect/>
+                          </a:stretch>
+                        </pic:blipFill>
+                        <pic:spPr bwMode="auto">
+                          <a:xfrm>
+                            <a:off x="0" y="0"/>
+                            <a:ext cx="152400" cy="152400"/>
+                          </a:xfrm>
+                          <a:prstGeom prst="rect">
+                            <a:avLst/>
+                          </a:prstGeom>
+                          <a:noFill/>
+                          <a:ln w="9525">
+                            <a:noFill/>
+                            <a:headEnd/>
+                            <a:tailEnd/>
+                          </a:ln>
+                        </pic:spPr>
+                      </pic:pic>
+                    </a:graphicData>
+                  </a:graphic>
+                </wp:inline>
+              </w:drawing>
+            </w:r>
+            <w:r>
+              <w:t xml:space="preserve"> </w:t>
+            </w:r>
+            <w:r>
+              <w:t xml:space="preserve"> </w:t>
+            </w:r>
+            <w:r>
+              <w:t xml:space="preserve">Ergänzung zur Vorlesung: Notkommunikation</w:t>
+            </w:r>
+          </w:p>
+        </w:tc>
+      </w:tr>
+      <w:tr>
+        <w:trPr>
+          <w:cantSplit/>
+        </w:trPr>
+        <w:tc>
+          <w:tcPr>
+            <w:tcMar>
+              <w:top w:w="108" w:type="dxa"/>
+              <w:bottom w:w="108" w:type="dxa"/>
+            </w:tcMar>
+          </w:tcPr>
+          <w:p>
+            <w:pPr>
+              <w:pStyle w:val="BodyText"/>
+            </w:pPr>
+            <w:pPr>
+              <w:spacing w:before="16"/>
+            </w:pPr>
+            <w:r>
+              <w:t xml:space="preserve">Wer die eigene IT verliert, verliert meist auch die eigenen Kommunikationskanäle: E-Mail, Website, Intranet. Die Fälle dieser Sitzung zeigen Ersatzwege: Die Mainzer Stadtwerke richteten 2022 innerhalb weniger Tage eine neue Website unter einer Ersatzdomain und neue Kontaktadressen ein; die Hochschule Mainz informierte 2025 über ihre App und soziale Medien; AWS meldete 2017 den Status über Twitter, weil das Dashboard selbst betroffen war.</w:t>
+            </w:r>
+          </w:p>
+          <w:p>
+            <w:pPr>
+              <w:pStyle w:val="BodyText"/>
+            </w:pPr>
+            <w:r>
+              <w:t xml:space="preserve">Notkommunikation ist damit eine Resilienzfähigkeit im Sinne von Redundanz und Diversität. Sie muss vorbereitet sein – außerhalb der eigenen IT und mit Absendern, die die Empfänger kennen, denn Angreifer nutzen Ausfälle gern für gefälschte Nachrichten.</w:t>
+            </w:r>
+          </w:p>
+          <w:p>
+            <w:pPr>
+              <w:pStyle w:val="BodyText"/>
+            </w:pPr>
+            <w:pPr>
+              <w:spacing w:after="16"/>
+            </w:pPr>
+            <w:r>
+              <w:t xml:space="preserve">Quellenangaben unter</w:t>
+            </w:r>
+            <w:r>
+              <w:t xml:space="preserve"> </w:t>
+            </w:r>
+            <w:hyperlink r:id="rId34">
+              <w:r>
+                <w:rPr>
+                  <w:rStyle w:val="Hyperlink"/>
+                </w:rPr>
+                <w:t xml:space="preserve">Quellen</w:t>
+              </w:r>
+            </w:hyperlink>
+            <w:r>
+              <w:t xml:space="preserve">.</w:t>
+            </w:r>
+          </w:p>
+          <w:p/>
+        </w:tc>
+      </w:tr>
+    </w:tbl>
+    <w:p>
+      <w:pPr>
+        <w:pStyle w:val="CaptionedFigure"/>
+      </w:pPr>
+      <w:r>
+        <w:drawing>
+          <wp:inline>
+            <wp:extent cx="3451860" cy="2630436"/>
+            <wp:effectExtent b="0" l="0" r="0" t="0"/>
+            <wp:docPr descr="Primär- und Ersatzkanäle der Kommunikation" title="" id="76" name="Picture"/>
+            <a:graphic>
+              <a:graphicData uri="http://schemas.openxmlformats.org/drawingml/2006/picture">
+                <pic:pic>
+                  <pic:nvPicPr>
+                    <pic:cNvPr descr="../Präsentationen/Termin-04/assets/notkommunikation.png" id="77" name="Picture"/>
+                    <pic:cNvPicPr>
+                      <a:picLocks noChangeArrowheads="1" noChangeAspect="1"/>
+                    </pic:cNvPicPr>
+                  </pic:nvPicPr>
+                  <pic:blipFill>
+                    <a:blip r:embed="rId75"/>
+                    <a:stretch>
+                      <a:fillRect/>
+                    </a:stretch>
+                  </pic:blipFill>
+                  <pic:spPr bwMode="auto">
+                    <a:xfrm>
+                      <a:off x="0" y="0"/>
+                      <a:ext cx="3451860" cy="2630436"/>
+                    </a:xfrm>
+                    <a:prstGeom prst="rect">
+                      <a:avLst/>
+                    </a:prstGeom>
+                    <a:noFill/>
+                    <a:ln w="9525">
+                      <a:noFill/>
+                      <a:headEnd/>
+                      <a:tailEnd/>
+                    </a:ln>
+                  </pic:spPr>
+                </pic:pic>
+              </a:graphicData>
+            </a:graphic>
+          </wp:inline>
+        </w:drawing>
+      </w:r>
+    </w:p>
+    <w:p>
+      <w:pPr>
+        <w:pStyle w:val="ImageCaption"/>
+      </w:pPr>
+      <w:r>
+        <w:t xml:space="preserve">Primär- und Ersatzkanäle der Kommunikation</w:t>
+      </w:r>
+    </w:p>
+    <w:bookmarkEnd w:id="78"/>
+    <w:bookmarkEnd w:id="79"/>
+    <w:bookmarkStart w:id="90" w:name="Xafd2a0671bf2af6a304171a611c42b61d054a02"/>
     <w:p>
       <w:pPr>
         <w:pStyle w:val="Heading1"/>
@@ -1711,7 +3435,7 @@
         <w:t xml:space="preserve">.</w:t>
       </w:r>
     </w:p>
-    <w:bookmarkStart w:id="39" w:name="Xd3e8c28f8b287764a48ff7ce97fad4c37504b4f"/>
+    <w:bookmarkStart w:id="84" w:name="Xd3e8c28f8b287764a48ff7ce97fad4c37504b4f"/>
     <w:p>
       <w:pPr>
         <w:pStyle w:val="Heading2"/>
@@ -1835,18 +3559,18 @@
                 <wp:inline>
                   <wp:extent cx="152400" cy="152400"/>
                   <wp:effectExtent b="0" l="0" r="0" t="0"/>
-                  <wp:docPr descr="" title="" id="36" name="Picture"/>
+                  <wp:docPr descr="" title="" id="81" name="Picture"/>
                   <a:graphic>
                     <a:graphicData uri="http://schemas.openxmlformats.org/drawingml/2006/picture">
                       <pic:pic>
                         <pic:nvPicPr>
-                          <pic:cNvPr descr="C:\Users\dirkl\Tools\quarto\share\formats\docx\note.png" id="37" name="Picture"/>
+                          <pic:cNvPr descr="/usr/local/lib/python3.13/dist-packages/quarto_cli/share/formats/docx/note.png" id="82" name="Picture"/>
                           <pic:cNvPicPr>
                             <a:picLocks noChangeArrowheads="1" noChangeAspect="1"/>
                           </pic:cNvPicPr>
                         </pic:nvPicPr>
                         <pic:blipFill>
-                          <a:blip r:embed="rId35"/>
+                          <a:blip r:embed="rId80"/>
                           <a:stretch>
                             <a:fillRect/>
                           </a:stretch>
@@ -1927,7 +3651,7 @@
             <w:r>
               <w:t xml:space="preserve"> </w:t>
             </w:r>
-            <w:hyperlink r:id="rId38">
+            <w:hyperlink r:id="rId83">
               <w:r>
                 <w:rPr>
                   <w:rStyle w:val="Hyperlink"/>
@@ -1943,8 +3667,8 @@
         </w:tc>
       </w:tr>
     </w:tbl>
-    <w:bookmarkEnd w:id="39"/>
-    <w:bookmarkStart w:id="40" w:name="X43c05252681b27f61731e82a37288c6cd6e59dc"/>
+    <w:bookmarkEnd w:id="84"/>
+    <w:bookmarkStart w:id="85" w:name="X43c05252681b27f61731e82a37288c6cd6e59dc"/>
     <w:p>
       <w:pPr>
         <w:pStyle w:val="Heading2"/>
@@ -2018,8 +3742,8 @@
         <w:t xml:space="preserve">— nicht nur vorbereitende Dokumentation.</w:t>
       </w:r>
     </w:p>
-    <w:bookmarkEnd w:id="40"/>
-    <w:bookmarkStart w:id="43" w:name="X846a18c74ab18f96d8082d84361e2e26b428270"/>
+    <w:bookmarkEnd w:id="85"/>
+    <w:bookmarkStart w:id="88" w:name="X846a18c74ab18f96d8082d84361e2e26b428270"/>
     <w:p>
       <w:pPr>
         <w:pStyle w:val="Heading2"/>
@@ -2114,18 +3838,18 @@
                 <wp:inline>
                   <wp:extent cx="152400" cy="152400"/>
                   <wp:effectExtent b="0" l="0" r="0" t="0"/>
-                  <wp:docPr descr="" title="" id="41" name="Picture"/>
+                  <wp:docPr descr="" title="" id="86" name="Picture"/>
                   <a:graphic>
                     <a:graphicData uri="http://schemas.openxmlformats.org/drawingml/2006/picture">
                       <pic:pic>
                         <pic:nvPicPr>
-                          <pic:cNvPr descr="C:\Users\dirkl\Tools\quarto\share\formats\docx\note.png" id="42" name="Picture"/>
+                          <pic:cNvPr descr="/usr/local/lib/python3.13/dist-packages/quarto_cli/share/formats/docx/note.png" id="87" name="Picture"/>
                           <pic:cNvPicPr>
                             <a:picLocks noChangeArrowheads="1" noChangeAspect="1"/>
                           </pic:cNvPicPr>
                         </pic:nvPicPr>
                         <pic:blipFill>
-                          <a:blip r:embed="rId35"/>
+                          <a:blip r:embed="rId80"/>
                           <a:stretch>
                             <a:fillRect/>
                           </a:stretch>
@@ -2196,7 +3920,7 @@
             <w:r>
               <w:t xml:space="preserve"> </w:t>
             </w:r>
-            <w:hyperlink r:id="rId38">
+            <w:hyperlink r:id="rId83">
               <w:r>
                 <w:rPr>
                   <w:rStyle w:val="Hyperlink"/>
@@ -2212,8 +3936,8 @@
         </w:tc>
       </w:tr>
     </w:tbl>
-    <w:bookmarkEnd w:id="43"/>
-    <w:bookmarkStart w:id="44" w:name="Xf84713e1624de541b9808ffa828214d86fdb3b9"/>
+    <w:bookmarkEnd w:id="88"/>
+    <w:bookmarkStart w:id="89" w:name="Xf84713e1624de541b9808ffa828214d86fdb3b9"/>
     <w:p>
       <w:pPr>
         <w:pStyle w:val="Heading2"/>
@@ -2301,9 +4025,9 @@
         <w:t xml:space="preserve">Damit sind Threat-to-Resilience-Mappings nicht optional, sondern methodisch gefordert.</w:t>
       </w:r>
     </w:p>
-    <w:bookmarkEnd w:id="44"/>
-    <w:bookmarkEnd w:id="45"/>
-    <w:bookmarkStart w:id="46" w:name="Xcf1d8cfac717f2ac324c1de6b6422bdd6dc8c46"/>
+    <w:bookmarkEnd w:id="89"/>
+    <w:bookmarkEnd w:id="90"/>
+    <w:bookmarkStart w:id="91" w:name="Xcf1d8cfac717f2ac324c1de6b6422bdd6dc8c46"/>
     <w:p>
       <w:pPr>
         <w:pStyle w:val="Heading1"/>
@@ -2650,8 +4374,8 @@
         <w:t xml:space="preserve">Weiter mit dem abschließenden Kapitel.</w:t>
       </w:r>
     </w:p>
-    <w:bookmarkEnd w:id="46"/>
-    <w:bookmarkStart w:id="47" w:name="zusammenfassung-prüfungsrelevanz"/>
+    <w:bookmarkEnd w:id="91"/>
+    <w:bookmarkStart w:id="92" w:name="zusammenfassung-prüfungsrelevanz"/>
     <w:p>
       <w:pPr>
         <w:pStyle w:val="Heading1"/>
@@ -2803,8 +4527,8 @@
         <w:t xml:space="preserve">.</w:t>
       </w:r>
     </w:p>
-    <w:bookmarkEnd w:id="47"/>
-    <w:bookmarkStart w:id="48" w:name="prüfungsrelevante-leitfragen"/>
+    <w:bookmarkEnd w:id="92"/>
+    <w:bookmarkStart w:id="93" w:name="prüfungsrelevante-leitfragen"/>
     <w:p>
       <w:pPr>
         <w:pStyle w:val="Heading1"/>
@@ -2868,8 +4592,8 @@
         <w:t xml:space="preserve">Erklären Sie an einem Beispiel, warum Identity ein versteckter SPOF ist.</w:t>
       </w:r>
     </w:p>
-    <w:bookmarkEnd w:id="48"/>
-    <w:bookmarkStart w:id="53" w:name="bibliography"/>
+    <w:bookmarkEnd w:id="93"/>
+    <w:bookmarkStart w:id="98" w:name="bibliography"/>
     <w:p>
       <w:pPr>
         <w:pStyle w:val="Heading1"/>
@@ -2878,8 +4602,8 @@
         <w:t xml:space="preserve">Literatur</w:t>
       </w:r>
     </w:p>
-    <w:bookmarkStart w:id="52" w:name="refs"/>
-    <w:bookmarkStart w:id="49" w:name="ref-bsi2004"/>
+    <w:bookmarkStart w:id="97" w:name="refs"/>
+    <w:bookmarkStart w:id="94" w:name="ref-bsi2004"/>
     <w:p>
       <w:pPr>
         <w:pStyle w:val="Bibliography"/>
@@ -2888,8 +4612,8 @@
         <w:t xml:space="preserve">BSI-Standard 200-4: Business Continuity Management (2023).</w:t>
       </w:r>
     </w:p>
-    <w:bookmarkEnd w:id="49"/>
-    <w:bookmarkStart w:id="51" w:name="ref-nist800160v2r1"/>
+    <w:bookmarkEnd w:id="94"/>
+    <w:bookmarkStart w:id="96" w:name="ref-nist800160v2r1"/>
     <w:p>
       <w:pPr>
         <w:pStyle w:val="Bibliography"/>
@@ -2913,7 +4637,7 @@
       <w:r>
         <w:t xml:space="preserve"> </w:t>
       </w:r>
-      <w:hyperlink r:id="rId50">
+      <w:hyperlink r:id="rId95">
         <w:r>
           <w:rPr>
             <w:rStyle w:val="Hyperlink"/>
@@ -2925,9 +4649,9 @@
         <w:t xml:space="preserve">.</w:t>
       </w:r>
     </w:p>
-    <w:bookmarkEnd w:id="51"/>
-    <w:bookmarkEnd w:id="52"/>
-    <w:bookmarkEnd w:id="53"/>
+    <w:bookmarkEnd w:id="96"/>
+    <w:bookmarkEnd w:id="97"/>
+    <w:bookmarkEnd w:id="98"/>
     <w:sectPr>
       <w:headerReference r:id="rId9" w:type="default"/>
       <w:footerReference r:id="rId10" w:type="default"/>

</xml_diff>